<commit_message>
chore(fixtures): refresh footer-page-number.docx assets
</commit_message>
<xml_diff>
--- a/e2e/fixtures/footer-page-number.docx
+++ b/e2e/fixtures/footer-page-number.docx
@@ -327,7 +327,7 @@
           </w:p>
           <w:p>
             <w:r>
-              <w:t>Matej Novák</w:t>
+              <w:t>Jane Doe</w:t>
             </w:r>
           </w:p>
         </w:tc>
@@ -6266,7 +6266,7 @@
                 <w:sz w:val="17"/>
                 <w:szCs w:val="17"/>
               </w:rPr>
-              <w:t>VÚB share: {vub_share_pct} ({vub_existing_m}m of {total_debt_m}m)</w:t>
+              <w:t>Acme share: {client_share_pct} ({client_existing_m}m of {total_debt_m}m)</w:t>
             </w:r>
           </w:p>
         </w:tc>
@@ -6723,7 +6723,7 @@
                 <w:sz w:val="17"/>
                 <w:szCs w:val="17"/>
               </w:rPr>
-              <w:t>Matej Novák  ·  Corporate Banking, {rm_sector}</w:t>
+              <w:t>Jane Doe  ·  Corporate Banking, {rm_sector}</w:t>
             </w:r>
           </w:p>
           <w:p>
@@ -7024,7 +7024,7 @@
         <wp:inline distT="0" distB="0" distL="0" distR="0" wp14:anchorId="67CE72C3" wp14:editId="76159ED8">
           <wp:extent cx="1371600" cy="411480"/>
           <wp:effectExtent l="0" t="0" r="0" b="0"/>
-          <wp:docPr id="1" name="VUB Logo"/>
+          <wp:docPr id="1" name="Acme Logo"/>
           <wp:cNvGraphicFramePr>
             <a:graphicFrameLocks xmlns:a="http://schemas.openxmlformats.org/drawingml/2006/main" noChangeAspect="1"/>
           </wp:cNvGraphicFramePr>
@@ -7032,7 +7032,7 @@
             <a:graphicData uri="http://schemas.openxmlformats.org/drawingml/2006/picture">
               <pic:pic xmlns:pic="http://schemas.openxmlformats.org/drawingml/2006/picture">
                 <pic:nvPicPr>
-                  <pic:cNvPr id="1" name="VUB Logo"/>
+                  <pic:cNvPr id="1" name="Acme Logo"/>
                   <pic:cNvPicPr/>
                 </pic:nvPicPr>
                 <pic:blipFill>

</xml_diff>

<commit_message>
chore(i18n): fill in missing locale translations
Fill the remaining null strings across all nine locales so they no longer
fall back to English.

Co-Authored-By: Claude Fable 5 <noreply@anthropic.com>
</commit_message>
<xml_diff>
--- a/e2e/fixtures/footer-page-number.docx
+++ b/e2e/fixtures/footer-page-number.docx
@@ -362,7 +362,7 @@
           </w:p>
           <w:p>
             <w:r>
-              <w:t>Jana Kováčová</w:t>
+              <w:t>Jana Vzorová</w:t>
             </w:r>
           </w:p>
         </w:tc>
@@ -6768,7 +6768,7 @@
                 <w:sz w:val="17"/>
                 <w:szCs w:val="17"/>
               </w:rPr>
-              <w:t>Jana Kováčová  ·  Corporate Credit Risk</w:t>
+              <w:t>Jana Vzorová  ·  Corporate Credit Risk</w:t>
             </w:r>
           </w:p>
           <w:p>

</xml_diff>